<commit_message>
Checkpoint 4.1 worksheet: make data-indexing and LLM-role coverage explicit
Added an explicit restatement of the base BM25 chunking scheme (previously
only in the script/README, not the worksheet itself) and a dedicated
explanation of the three distinct points where the LLM participates
(decomposition, answer generation over labeled context, judge scoring) --
both were previously only implicit in the existing responses.

Co-Authored-By: Claude Sonnet 5 <noreply@anthropic.com>
</commit_message>
<xml_diff>
--- a/Capstone Checkpoint 4.1/Required_Capstone_Checkpoint_4_1_Worksheet_completed.docx
+++ b/Capstone Checkpoint 4.1/Required_Capstone_Checkpoint_4_1_Worksheet_completed.docx
@@ -1787,7 +1787,7 @@
               <w:t>Response:</w:t>
             </w:r>
             <w:r>
-              <w:t xml:space="preserve"> I extract each paper's first author's last name directly from its filename, exploiting the DBLP bibkey convention (e.g. 'EllisMSST18' -&gt; 'Ellis'; non-DBLP files like 'Gupta2024' encode it directly) — verified by hand against all 153 filenames before trusting it (104/153 resolved; the other 49 are arXiv abs-IDs or edited-proceedings volumes with no single first author, a disclosed limitation, see Step 6). same_author edges connect any two papers sharing that lastname (274 edges, built from simple grouping, zero false-positive risk). cites edges are built by scanning each paper's full text for '&lt;lastname&gt; et al.' or '&lt;lastname&gt; and &lt;Name&gt;' mentions, then requiring a 4-digit year within ~20 characters of the mention that matches a specific candidate paper's year (also extracted from its filename) before adding the edge (106 edges). I verified this year check directly: Bowers' paper mentions 'Ellis et al.' 26 times, almost all tagged '2021' (a DreamCoder paper not in my corpus), but exactly the instances tagged '2018' produce edges to Ellis et al.'s two 2018 papers in my corpus — without the year check, the edge would incorrectly point at all 6 Ellis papers in the corpus regardless of which one was actually meant.</w:t>
+              <w:t xml:space="preserve"> Base indexing (unchanged from Checkpoints 2.1/3.1, extended here with a graph layer on top): each of the 153 papers is split into ~250-word chunks with 50-word overlap (15,501 chunks total), indexed with BM25 (term-frequency/inverse-document-frequency over the whole chunk set). The new architecture adds a second, paper-level index alongside this chunk-level one: a directed graph where each of the 153 papers is a single node (not chunk-level — citation and authorship are properties of a paper as a whole, not of one 250-word window of it). I extract each paper's first author's last name directly from its filename, exploiting the DBLP bibkey convention (e.g. 'EllisMSST18' -&gt; 'Ellis'; non-DBLP files like 'Gupta2024' encode it directly) — verified by hand against all 153 filenames before trusting it (104/153 resolved; the other 49 are arXiv abs-IDs or edited-proceedings volumes with no single first author, a disclosed limitation, see Step 6). same_author edges connect any two papers sharing that lastname (274 edges, built from simple grouping, zero false-positive risk). cites edges are built by scanning each paper's full text for '&lt;lastname&gt; et al.' or '&lt;lastname&gt; and &lt;Name&gt;' mentions, then requiring a 4-digit year within ~20 characters of the mention that matches a specific candidate paper's year (also extracted from its filename) before adding the edge (106 edges). I verified this year check directly: Bowers' paper mentions 'Ellis et al.' 26 times, almost all tagged '2021' (a DreamCoder paper not in my corpus), but exactly the instances tagged '2018' produce edges to Ellis et al.'s two 2018 papers in my corpus — without the year check, the edge would incorrectly point at all 6 Ellis papers in the corpus regardless of which one was actually meant.</w:t>
             </w:r>
           </w:p>
           <w:p>
@@ -1900,7 +1900,7 @@
               <w:t>Response:</w:t>
             </w:r>
             <w:r>
-              <w:t xml:space="preserve"> graph_retrieve(query, k=3, reserve_slots=1) in capstone_checkpoint_4_1_advanced_retrieval_starter.py: takes the baseline's top BM25 seeds, then for each seed paper looks up its graph neighbors (same_author/cites) not already present, and swaps the weakest-scoring seed for the best available related paper's abstract chunk — capping the TOTAL returned at k=3, matching baseline's count exactly, so the two are directly comparable on an equal document budget. answer_from_docs() labels every document in the prompt as either '[PRIMARY (keyword match)]' or '[RELATED CONTEXT (via same_author/cites: &lt;name&gt;)]' so the LLM — and anyone reading the log — can see which documents matched the query directly versus which were added because they're graph-connected to one. For Q4, the graph system retrieved: Bowers chunk 74 (PRIMARY), Ellis EllisRST18 chunk 0 (RELATED, via cites: Ellis), Ellis EllisMSST18 chunk 0 (RELATED, via cites: Ellis) — full evidence in checkpoint_4_1_responses.log.</w:t>
+              <w:t xml:space="preserve"> graph_retrieve(query, k=3, reserve_slots=1) in capstone_checkpoint_4_1_advanced_retrieval_starter.py: takes the baseline's top BM25 seeds, then for each seed paper looks up its graph neighbors (same_author/cites) not already present, and swaps the weakest-scoring seed for the best available related paper's abstract chunk — capping the TOTAL returned at k=3, matching baseline's count exactly, so the two are directly comparable on an equal document budget. answer_from_docs() labels every document in the prompt as either '[PRIMARY (keyword match)]' or '[RELATED CONTEXT (via same_author/cites: &lt;name&gt;)]' so the LLM — and anyone reading the log — can see which documents matched the query directly versus which were added because they're graph-connected to one. For Q4, the graph system retrieved: Bowers chunk 74 (PRIMARY), Ellis EllisRST18 chunk 0 (RELATED, via cites: Ellis), Ellis EllisMSST18 chunk 0 (RELATED, via cites: Ellis) — full evidence in checkpoint_4_1_responses.log. The LLM participates at three distinct points, not just final-answer generation: (1) decompose_query() calls it to split a question into sub-queries when exploring query decomposition as an alternative strategy (it is NOT used in the graph path itself — graph traversal is pure code/data, no LLM call); (2) answer_from_docs() calls it once per query to generate the final answer, given the PRIMARY/RELATED-labeled context described above — this labeling is deliberately exposed to the LLM so it can weigh a direct keyword match differently from a document added only because it's graph-connected; (3) in the Step 5b comparative evaluation, a separate LLM-judge call scores each answer pass/fail against Checkpoint 3.1's grading notes, reused unchanged from 3.1 so the same judge evaluates both the baseline and the graph-augmented answer for a fair comparison.</w:t>
             </w:r>
           </w:p>
           <w:p>

</xml_diff>